<commit_message>
iconos SVG convertidos en components mediante script 'generar:icons' + armado de components 'Ajustes, Buttons, Footer, Forms, Header, IconLabel, PerfilEdit
</commit_message>
<xml_diff>
--- a/diseno/diseno-AppCercaTuyo.docx
+++ b/diseno/diseno-AppCercaTuyo.docx
@@ -6,9 +6,11 @@
       <w:r>
         <w:t>https://www.figma.com/design/ImuN96u1cNlT43oowRcL52/AppCercaTuyo?node-id=59800-555&amp;p=f&amp;t=tQflpRUdbOABktQf-0</w:t>
       </w:r>
-      <w:bookmarkStart w:id="0" w:name="_GoBack"/>
-      <w:bookmarkEnd w:id="0"/>
       <w:r>
+        <w:rPr>
+          <w:noProof/>
+          <w:lang w:eastAsia="es-AR"/>
+        </w:rPr>
         <w:drawing>
           <wp:inline distT="0" distB="0" distL="0" distR="0" wp14:anchorId="35B89572" wp14:editId="6F0D21DC">
             <wp:extent cx="5612130" cy="2562225"/>
@@ -48,6 +50,10 @@
     </w:p>
     <w:p>
       <w:r>
+        <w:rPr>
+          <w:noProof/>
+          <w:lang w:eastAsia="es-AR"/>
+        </w:rPr>
         <w:drawing>
           <wp:inline distT="0" distB="0" distL="0" distR="0" wp14:anchorId="1AF4F3A7" wp14:editId="42340869">
             <wp:extent cx="2000529" cy="3867690"/>
@@ -88,6 +94,10 @@
         <w:t xml:space="preserve"> </w:t>
       </w:r>
       <w:r>
+        <w:rPr>
+          <w:noProof/>
+          <w:lang w:eastAsia="es-AR"/>
+        </w:rPr>
         <w:drawing>
           <wp:inline distT="0" distB="0" distL="0" distR="0" wp14:anchorId="733D8A2E" wp14:editId="44FF3622">
             <wp:extent cx="1924319" cy="3572374"/>
@@ -128,6 +138,10 @@
         <w:t xml:space="preserve"> </w:t>
       </w:r>
       <w:r>
+        <w:rPr>
+          <w:noProof/>
+          <w:lang w:eastAsia="es-AR"/>
+        </w:rPr>
         <w:drawing>
           <wp:inline distT="0" distB="0" distL="0" distR="0" wp14:anchorId="73F22B35" wp14:editId="2C709494">
             <wp:extent cx="1848108" cy="3524742"/>
@@ -168,6 +182,10 @@
         <w:t xml:space="preserve"> </w:t>
       </w:r>
       <w:r>
+        <w:rPr>
+          <w:noProof/>
+          <w:lang w:eastAsia="es-AR"/>
+        </w:rPr>
         <w:drawing>
           <wp:inline distT="0" distB="0" distL="0" distR="0" wp14:anchorId="66A5F6A8" wp14:editId="49D3A262">
             <wp:extent cx="1705213" cy="1876687"/>
@@ -207,6 +225,10 @@
     </w:p>
     <w:p>
       <w:r>
+        <w:rPr>
+          <w:noProof/>
+          <w:lang w:eastAsia="es-AR"/>
+        </w:rPr>
         <w:lastRenderedPageBreak/>
         <w:drawing>
           <wp:inline distT="0" distB="0" distL="0" distR="0" wp14:anchorId="0A89172C" wp14:editId="758CEFC2">
@@ -248,6 +270,10 @@
         <w:t xml:space="preserve"> </w:t>
       </w:r>
       <w:r>
+        <w:rPr>
+          <w:noProof/>
+          <w:lang w:eastAsia="es-AR"/>
+        </w:rPr>
         <w:drawing>
           <wp:inline distT="0" distB="0" distL="0" distR="0" wp14:anchorId="744355DE" wp14:editId="41A4BA19">
             <wp:extent cx="3229426" cy="3658111"/>
@@ -285,6 +311,10 @@
         </w:drawing>
       </w:r>
       <w:r>
+        <w:rPr>
+          <w:noProof/>
+          <w:lang w:eastAsia="es-AR"/>
+        </w:rPr>
         <w:drawing>
           <wp:inline distT="0" distB="0" distL="0" distR="0" wp14:anchorId="51A55DFD" wp14:editId="195ECFAD">
             <wp:extent cx="2781688" cy="3343742"/>
@@ -325,6 +355,10 @@
         <w:t xml:space="preserve"> </w:t>
       </w:r>
       <w:r>
+        <w:rPr>
+          <w:noProof/>
+          <w:lang w:eastAsia="es-AR"/>
+        </w:rPr>
         <w:drawing>
           <wp:inline distT="0" distB="0" distL="0" distR="0" wp14:anchorId="78E7D70A" wp14:editId="71318B79">
             <wp:extent cx="1562318" cy="3715269"/>
@@ -361,6 +395,621 @@
           </wp:inline>
         </w:drawing>
       </w:r>
+    </w:p>
+    <w:tbl>
+      <w:tblPr>
+        <w:tblW w:w="0" w:type="auto"/>
+        <w:tblCellSpacing w:w="15" w:type="dxa"/>
+        <w:tblCellMar>
+          <w:top w:w="15" w:type="dxa"/>
+          <w:left w:w="15" w:type="dxa"/>
+          <w:bottom w:w="15" w:type="dxa"/>
+          <w:right w:w="15" w:type="dxa"/>
+        </w:tblCellMar>
+        <w:tblLook w:val="04A0" w:firstRow="1" w:lastRow="0" w:firstColumn="1" w:lastColumn="0" w:noHBand="0" w:noVBand="1"/>
+      </w:tblPr>
+      <w:tblGrid>
+        <w:gridCol w:w="2969"/>
+        <w:gridCol w:w="620"/>
+        <w:gridCol w:w="939"/>
+      </w:tblGrid>
+      <w:tr>
+        <w:trPr>
+          <w:tblHeader/>
+          <w:tblCellSpacing w:w="15" w:type="dxa"/>
+        </w:trPr>
+        <w:tc>
+          <w:tcPr>
+            <w:tcW w:w="0" w:type="auto"/>
+            <w:vAlign w:val="center"/>
+            <w:hideMark/>
+          </w:tcPr>
+          <w:p>
+            <w:pPr>
+              <w:spacing w:after="0" w:line="240" w:lineRule="auto"/>
+              <w:jc w:val="center"/>
+              <w:rPr>
+                <w:rFonts w:eastAsia="Times New Roman" w:cstheme="minorHAnsi"/>
+                <w:b/>
+                <w:bCs/>
+                <w:lang w:eastAsia="es-AR"/>
+              </w:rPr>
+            </w:pPr>
+            <w:r>
+              <w:rPr>
+                <w:rFonts w:eastAsia="Times New Roman" w:cstheme="minorHAnsi"/>
+                <w:b/>
+                <w:bCs/>
+                <w:lang w:eastAsia="es-AR"/>
+              </w:rPr>
+              <w:t>Uso</w:t>
+            </w:r>
+            <w:bookmarkStart w:id="0" w:name="_GoBack"/>
+            <w:bookmarkEnd w:id="0"/>
+          </w:p>
+        </w:tc>
+        <w:tc>
+          <w:tcPr>
+            <w:tcW w:w="590" w:type="dxa"/>
+            <w:vAlign w:val="center"/>
+            <w:hideMark/>
+          </w:tcPr>
+          <w:p>
+            <w:pPr>
+              <w:spacing w:after="0" w:line="240" w:lineRule="auto"/>
+              <w:jc w:val="center"/>
+              <w:rPr>
+                <w:rFonts w:eastAsia="Times New Roman" w:cstheme="minorHAnsi"/>
+                <w:b/>
+                <w:bCs/>
+                <w:lang w:eastAsia="es-AR"/>
+              </w:rPr>
+            </w:pPr>
+            <w:proofErr w:type="spellStart"/>
+            <w:r>
+              <w:rPr>
+                <w:rFonts w:eastAsia="Times New Roman" w:cstheme="minorHAnsi"/>
+                <w:b/>
+                <w:bCs/>
+                <w:lang w:eastAsia="es-AR"/>
+              </w:rPr>
+              <w:t>px</w:t>
+            </w:r>
+            <w:proofErr w:type="spellEnd"/>
+          </w:p>
+        </w:tc>
+        <w:tc>
+          <w:tcPr>
+            <w:tcW w:w="0" w:type="auto"/>
+            <w:vAlign w:val="center"/>
+            <w:hideMark/>
+          </w:tcPr>
+          <w:p>
+            <w:pPr>
+              <w:spacing w:after="0" w:line="240" w:lineRule="auto"/>
+              <w:jc w:val="center"/>
+              <w:rPr>
+                <w:rFonts w:eastAsia="Times New Roman" w:cstheme="minorHAnsi"/>
+                <w:b/>
+                <w:bCs/>
+                <w:lang w:eastAsia="es-AR"/>
+              </w:rPr>
+            </w:pPr>
+            <w:r>
+              <w:rPr>
+                <w:rFonts w:eastAsia="Times New Roman" w:cstheme="minorHAnsi"/>
+                <w:b/>
+                <w:bCs/>
+                <w:lang w:eastAsia="es-AR"/>
+              </w:rPr>
+              <w:t>rem</w:t>
+            </w:r>
+          </w:p>
+        </w:tc>
+      </w:tr>
+      <w:tr>
+        <w:trPr>
+          <w:tblCellSpacing w:w="15" w:type="dxa"/>
+        </w:trPr>
+        <w:tc>
+          <w:tcPr>
+            <w:tcW w:w="0" w:type="auto"/>
+            <w:vAlign w:val="center"/>
+            <w:hideMark/>
+          </w:tcPr>
+          <w:p>
+            <w:pPr>
+              <w:spacing w:after="0" w:line="240" w:lineRule="auto"/>
+              <w:rPr>
+                <w:rFonts w:eastAsia="Times New Roman" w:cstheme="minorHAnsi"/>
+                <w:lang w:eastAsia="es-AR"/>
+              </w:rPr>
+            </w:pPr>
+            <w:r>
+              <w:rPr>
+                <w:rFonts w:eastAsia="Times New Roman" w:cstheme="minorHAnsi"/>
+                <w:b/>
+                <w:bCs/>
+                <w:lang w:eastAsia="es-AR"/>
+              </w:rPr>
+              <w:t>Título Principal (H1)</w:t>
+            </w:r>
+          </w:p>
+        </w:tc>
+        <w:tc>
+          <w:tcPr>
+            <w:tcW w:w="590" w:type="dxa"/>
+            <w:vAlign w:val="center"/>
+            <w:hideMark/>
+          </w:tcPr>
+          <w:p>
+            <w:pPr>
+              <w:spacing w:after="0" w:line="240" w:lineRule="auto"/>
+              <w:rPr>
+                <w:rFonts w:eastAsia="Times New Roman" w:cstheme="minorHAnsi"/>
+                <w:lang w:eastAsia="es-AR"/>
+              </w:rPr>
+            </w:pPr>
+            <w:r>
+              <w:rPr>
+                <w:rFonts w:eastAsia="Times New Roman" w:cstheme="minorHAnsi"/>
+                <w:lang w:eastAsia="es-AR"/>
+              </w:rPr>
+              <w:t>32px</w:t>
+            </w:r>
+          </w:p>
+        </w:tc>
+        <w:tc>
+          <w:tcPr>
+            <w:tcW w:w="0" w:type="auto"/>
+            <w:vAlign w:val="center"/>
+            <w:hideMark/>
+          </w:tcPr>
+          <w:p>
+            <w:pPr>
+              <w:spacing w:after="0" w:line="240" w:lineRule="auto"/>
+              <w:rPr>
+                <w:rFonts w:eastAsia="Times New Roman" w:cstheme="minorHAnsi"/>
+                <w:lang w:eastAsia="es-AR"/>
+              </w:rPr>
+            </w:pPr>
+            <w:r>
+              <w:rPr>
+                <w:rFonts w:eastAsia="Times New Roman" w:cstheme="minorHAnsi"/>
+                <w:lang w:eastAsia="es-AR"/>
+              </w:rPr>
+              <w:t>2rem</w:t>
+            </w:r>
+          </w:p>
+        </w:tc>
+      </w:tr>
+      <w:tr>
+        <w:trPr>
+          <w:tblCellSpacing w:w="15" w:type="dxa"/>
+        </w:trPr>
+        <w:tc>
+          <w:tcPr>
+            <w:tcW w:w="0" w:type="auto"/>
+            <w:vAlign w:val="center"/>
+            <w:hideMark/>
+          </w:tcPr>
+          <w:p>
+            <w:pPr>
+              <w:spacing w:after="0" w:line="240" w:lineRule="auto"/>
+              <w:rPr>
+                <w:rFonts w:eastAsia="Times New Roman" w:cstheme="minorHAnsi"/>
+                <w:lang w:eastAsia="es-AR"/>
+              </w:rPr>
+            </w:pPr>
+            <w:r>
+              <w:rPr>
+                <w:rFonts w:eastAsia="Times New Roman" w:cstheme="minorHAnsi"/>
+                <w:b/>
+                <w:bCs/>
+                <w:lang w:eastAsia="es-AR"/>
+              </w:rPr>
+              <w:t>Subtítulo (H2)</w:t>
+            </w:r>
+          </w:p>
+        </w:tc>
+        <w:tc>
+          <w:tcPr>
+            <w:tcW w:w="590" w:type="dxa"/>
+            <w:vAlign w:val="center"/>
+            <w:hideMark/>
+          </w:tcPr>
+          <w:p>
+            <w:pPr>
+              <w:spacing w:after="0" w:line="240" w:lineRule="auto"/>
+              <w:rPr>
+                <w:rFonts w:eastAsia="Times New Roman" w:cstheme="minorHAnsi"/>
+                <w:lang w:eastAsia="es-AR"/>
+              </w:rPr>
+            </w:pPr>
+            <w:r>
+              <w:rPr>
+                <w:rFonts w:eastAsia="Times New Roman" w:cstheme="minorHAnsi"/>
+                <w:lang w:eastAsia="es-AR"/>
+              </w:rPr>
+              <w:t>24px</w:t>
+            </w:r>
+          </w:p>
+        </w:tc>
+        <w:tc>
+          <w:tcPr>
+            <w:tcW w:w="0" w:type="auto"/>
+            <w:vAlign w:val="center"/>
+            <w:hideMark/>
+          </w:tcPr>
+          <w:p>
+            <w:pPr>
+              <w:spacing w:after="0" w:line="240" w:lineRule="auto"/>
+              <w:rPr>
+                <w:rFonts w:eastAsia="Times New Roman" w:cstheme="minorHAnsi"/>
+                <w:lang w:eastAsia="es-AR"/>
+              </w:rPr>
+            </w:pPr>
+            <w:r>
+              <w:rPr>
+                <w:rFonts w:eastAsia="Times New Roman" w:cstheme="minorHAnsi"/>
+                <w:lang w:eastAsia="es-AR"/>
+              </w:rPr>
+              <w:t>1.5rem</w:t>
+            </w:r>
+          </w:p>
+        </w:tc>
+      </w:tr>
+      <w:tr>
+        <w:trPr>
+          <w:tblCellSpacing w:w="15" w:type="dxa"/>
+        </w:trPr>
+        <w:tc>
+          <w:tcPr>
+            <w:tcW w:w="0" w:type="auto"/>
+            <w:vAlign w:val="center"/>
+            <w:hideMark/>
+          </w:tcPr>
+          <w:p>
+            <w:pPr>
+              <w:spacing w:after="0" w:line="240" w:lineRule="auto"/>
+              <w:rPr>
+                <w:rFonts w:eastAsia="Times New Roman" w:cstheme="minorHAnsi"/>
+                <w:lang w:eastAsia="es-AR"/>
+              </w:rPr>
+            </w:pPr>
+            <w:r>
+              <w:rPr>
+                <w:rFonts w:eastAsia="Times New Roman" w:cstheme="minorHAnsi"/>
+                <w:b/>
+                <w:bCs/>
+                <w:lang w:eastAsia="es-AR"/>
+              </w:rPr>
+              <w:t xml:space="preserve">Título de sección / </w:t>
+            </w:r>
+            <w:proofErr w:type="spellStart"/>
+            <w:r>
+              <w:rPr>
+                <w:rFonts w:eastAsia="Times New Roman" w:cstheme="minorHAnsi"/>
+                <w:b/>
+                <w:bCs/>
+                <w:lang w:eastAsia="es-AR"/>
+              </w:rPr>
+              <w:t>Header</w:t>
+            </w:r>
+            <w:proofErr w:type="spellEnd"/>
+            <w:r>
+              <w:rPr>
+                <w:rFonts w:eastAsia="Times New Roman" w:cstheme="minorHAnsi"/>
+                <w:b/>
+                <w:bCs/>
+                <w:lang w:eastAsia="es-AR"/>
+              </w:rPr>
+              <w:t xml:space="preserve"> app</w:t>
+            </w:r>
+          </w:p>
+        </w:tc>
+        <w:tc>
+          <w:tcPr>
+            <w:tcW w:w="590" w:type="dxa"/>
+            <w:vAlign w:val="center"/>
+            <w:hideMark/>
+          </w:tcPr>
+          <w:p>
+            <w:pPr>
+              <w:spacing w:after="0" w:line="240" w:lineRule="auto"/>
+              <w:rPr>
+                <w:rFonts w:eastAsia="Times New Roman" w:cstheme="minorHAnsi"/>
+                <w:lang w:eastAsia="es-AR"/>
+              </w:rPr>
+            </w:pPr>
+            <w:r>
+              <w:rPr>
+                <w:rFonts w:eastAsia="Times New Roman" w:cstheme="minorHAnsi"/>
+                <w:lang w:eastAsia="es-AR"/>
+              </w:rPr>
+              <w:t>20px</w:t>
+            </w:r>
+          </w:p>
+        </w:tc>
+        <w:tc>
+          <w:tcPr>
+            <w:tcW w:w="0" w:type="auto"/>
+            <w:vAlign w:val="center"/>
+            <w:hideMark/>
+          </w:tcPr>
+          <w:p>
+            <w:pPr>
+              <w:spacing w:after="0" w:line="240" w:lineRule="auto"/>
+              <w:rPr>
+                <w:rFonts w:eastAsia="Times New Roman" w:cstheme="minorHAnsi"/>
+                <w:lang w:eastAsia="es-AR"/>
+              </w:rPr>
+            </w:pPr>
+            <w:r>
+              <w:rPr>
+                <w:rFonts w:eastAsia="Times New Roman" w:cstheme="minorHAnsi"/>
+                <w:lang w:eastAsia="es-AR"/>
+              </w:rPr>
+              <w:t>1.25rem</w:t>
+            </w:r>
+          </w:p>
+        </w:tc>
+      </w:tr>
+      <w:tr>
+        <w:trPr>
+          <w:tblCellSpacing w:w="15" w:type="dxa"/>
+        </w:trPr>
+        <w:tc>
+          <w:tcPr>
+            <w:tcW w:w="0" w:type="auto"/>
+            <w:vAlign w:val="center"/>
+            <w:hideMark/>
+          </w:tcPr>
+          <w:p>
+            <w:pPr>
+              <w:spacing w:after="0" w:line="240" w:lineRule="auto"/>
+              <w:rPr>
+                <w:rFonts w:eastAsia="Times New Roman" w:cstheme="minorHAnsi"/>
+                <w:lang w:eastAsia="es-AR"/>
+              </w:rPr>
+            </w:pPr>
+            <w:r>
+              <w:rPr>
+                <w:rFonts w:eastAsia="Times New Roman" w:cstheme="minorHAnsi"/>
+                <w:b/>
+                <w:bCs/>
+                <w:lang w:eastAsia="es-AR"/>
+              </w:rPr>
+              <w:t>Texto base / párrafos</w:t>
+            </w:r>
+          </w:p>
+        </w:tc>
+        <w:tc>
+          <w:tcPr>
+            <w:tcW w:w="590" w:type="dxa"/>
+            <w:vAlign w:val="center"/>
+            <w:hideMark/>
+          </w:tcPr>
+          <w:p>
+            <w:pPr>
+              <w:spacing w:after="0" w:line="240" w:lineRule="auto"/>
+              <w:rPr>
+                <w:rFonts w:eastAsia="Times New Roman" w:cstheme="minorHAnsi"/>
+                <w:lang w:eastAsia="es-AR"/>
+              </w:rPr>
+            </w:pPr>
+            <w:r>
+              <w:rPr>
+                <w:rFonts w:eastAsia="Times New Roman" w:cstheme="minorHAnsi"/>
+                <w:lang w:eastAsia="es-AR"/>
+              </w:rPr>
+              <w:t>16px</w:t>
+            </w:r>
+          </w:p>
+        </w:tc>
+        <w:tc>
+          <w:tcPr>
+            <w:tcW w:w="0" w:type="auto"/>
+            <w:vAlign w:val="center"/>
+            <w:hideMark/>
+          </w:tcPr>
+          <w:p>
+            <w:pPr>
+              <w:spacing w:after="0" w:line="240" w:lineRule="auto"/>
+              <w:rPr>
+                <w:rFonts w:eastAsia="Times New Roman" w:cstheme="minorHAnsi"/>
+                <w:lang w:eastAsia="es-AR"/>
+              </w:rPr>
+            </w:pPr>
+            <w:r>
+              <w:rPr>
+                <w:rFonts w:eastAsia="Times New Roman" w:cstheme="minorHAnsi"/>
+                <w:lang w:eastAsia="es-AR"/>
+              </w:rPr>
+              <w:t>1rem</w:t>
+            </w:r>
+          </w:p>
+        </w:tc>
+      </w:tr>
+      <w:tr>
+        <w:trPr>
+          <w:tblCellSpacing w:w="15" w:type="dxa"/>
+        </w:trPr>
+        <w:tc>
+          <w:tcPr>
+            <w:tcW w:w="0" w:type="auto"/>
+            <w:vAlign w:val="center"/>
+            <w:hideMark/>
+          </w:tcPr>
+          <w:p>
+            <w:pPr>
+              <w:spacing w:after="0" w:line="240" w:lineRule="auto"/>
+              <w:rPr>
+                <w:rFonts w:eastAsia="Times New Roman" w:cstheme="minorHAnsi"/>
+                <w:lang w:eastAsia="es-AR"/>
+              </w:rPr>
+            </w:pPr>
+            <w:r>
+              <w:rPr>
+                <w:rFonts w:eastAsia="Times New Roman" w:cstheme="minorHAnsi"/>
+                <w:b/>
+                <w:bCs/>
+                <w:lang w:eastAsia="es-AR"/>
+              </w:rPr>
+              <w:t>Texto secundario / detalles</w:t>
+            </w:r>
+          </w:p>
+        </w:tc>
+        <w:tc>
+          <w:tcPr>
+            <w:tcW w:w="590" w:type="dxa"/>
+            <w:vAlign w:val="center"/>
+            <w:hideMark/>
+          </w:tcPr>
+          <w:p>
+            <w:pPr>
+              <w:spacing w:after="0" w:line="240" w:lineRule="auto"/>
+              <w:rPr>
+                <w:rFonts w:eastAsia="Times New Roman" w:cstheme="minorHAnsi"/>
+                <w:lang w:eastAsia="es-AR"/>
+              </w:rPr>
+            </w:pPr>
+            <w:r>
+              <w:rPr>
+                <w:rFonts w:eastAsia="Times New Roman" w:cstheme="minorHAnsi"/>
+                <w:lang w:eastAsia="es-AR"/>
+              </w:rPr>
+              <w:t>14px</w:t>
+            </w:r>
+          </w:p>
+        </w:tc>
+        <w:tc>
+          <w:tcPr>
+            <w:tcW w:w="0" w:type="auto"/>
+            <w:vAlign w:val="center"/>
+            <w:hideMark/>
+          </w:tcPr>
+          <w:p>
+            <w:pPr>
+              <w:spacing w:after="0" w:line="240" w:lineRule="auto"/>
+              <w:rPr>
+                <w:rFonts w:eastAsia="Times New Roman" w:cstheme="minorHAnsi"/>
+                <w:lang w:eastAsia="es-AR"/>
+              </w:rPr>
+            </w:pPr>
+            <w:r>
+              <w:rPr>
+                <w:rFonts w:eastAsia="Times New Roman" w:cstheme="minorHAnsi"/>
+                <w:lang w:eastAsia="es-AR"/>
+              </w:rPr>
+              <w:t>0.875rem</w:t>
+            </w:r>
+          </w:p>
+        </w:tc>
+      </w:tr>
+      <w:tr>
+        <w:trPr>
+          <w:tblCellSpacing w:w="15" w:type="dxa"/>
+        </w:trPr>
+        <w:tc>
+          <w:tcPr>
+            <w:tcW w:w="0" w:type="auto"/>
+            <w:vAlign w:val="center"/>
+            <w:hideMark/>
+          </w:tcPr>
+          <w:p>
+            <w:pPr>
+              <w:spacing w:after="0" w:line="240" w:lineRule="auto"/>
+              <w:rPr>
+                <w:rFonts w:eastAsia="Times New Roman" w:cstheme="minorHAnsi"/>
+                <w:lang w:eastAsia="es-AR"/>
+              </w:rPr>
+            </w:pPr>
+            <w:r>
+              <w:rPr>
+                <w:rFonts w:eastAsia="Times New Roman" w:cstheme="minorHAnsi"/>
+                <w:b/>
+                <w:bCs/>
+                <w:lang w:eastAsia="es-AR"/>
+              </w:rPr>
+              <w:t xml:space="preserve">Notas / </w:t>
+            </w:r>
+            <w:proofErr w:type="spellStart"/>
+            <w:r>
+              <w:rPr>
+                <w:rFonts w:eastAsia="Times New Roman" w:cstheme="minorHAnsi"/>
+                <w:b/>
+                <w:bCs/>
+                <w:lang w:eastAsia="es-AR"/>
+              </w:rPr>
+              <w:t>captions</w:t>
+            </w:r>
+            <w:proofErr w:type="spellEnd"/>
+            <w:r>
+              <w:rPr>
+                <w:rFonts w:eastAsia="Times New Roman" w:cstheme="minorHAnsi"/>
+                <w:b/>
+                <w:bCs/>
+                <w:lang w:eastAsia="es-AR"/>
+              </w:rPr>
+              <w:t xml:space="preserve"> muy pequeñas</w:t>
+            </w:r>
+          </w:p>
+        </w:tc>
+        <w:tc>
+          <w:tcPr>
+            <w:tcW w:w="590" w:type="dxa"/>
+            <w:vAlign w:val="center"/>
+            <w:hideMark/>
+          </w:tcPr>
+          <w:p>
+            <w:pPr>
+              <w:spacing w:after="0" w:line="240" w:lineRule="auto"/>
+              <w:rPr>
+                <w:rFonts w:eastAsia="Times New Roman" w:cstheme="minorHAnsi"/>
+                <w:lang w:eastAsia="es-AR"/>
+              </w:rPr>
+            </w:pPr>
+            <w:r>
+              <w:rPr>
+                <w:rFonts w:eastAsia="Times New Roman" w:cstheme="minorHAnsi"/>
+                <w:lang w:eastAsia="es-AR"/>
+              </w:rPr>
+              <w:t>12px</w:t>
+            </w:r>
+          </w:p>
+        </w:tc>
+        <w:tc>
+          <w:tcPr>
+            <w:tcW w:w="0" w:type="auto"/>
+            <w:vAlign w:val="center"/>
+            <w:hideMark/>
+          </w:tcPr>
+          <w:p>
+            <w:pPr>
+              <w:spacing w:after="0" w:line="240" w:lineRule="auto"/>
+              <w:rPr>
+                <w:rFonts w:eastAsia="Times New Roman" w:cstheme="minorHAnsi"/>
+                <w:lang w:eastAsia="es-AR"/>
+              </w:rPr>
+            </w:pPr>
+            <w:r>
+              <w:rPr>
+                <w:rFonts w:eastAsia="Times New Roman" w:cstheme="minorHAnsi"/>
+                <w:lang w:eastAsia="es-AR"/>
+              </w:rPr>
+              <w:t>0.75rem</w:t>
+            </w:r>
+          </w:p>
+        </w:tc>
+      </w:tr>
+    </w:tbl>
+    <w:p>
+      <w:pPr>
+        <w:rPr>
+          <w:rFonts w:cstheme="minorHAnsi"/>
+        </w:rPr>
+      </w:pPr>
     </w:p>
     <w:sectPr>
       <w:pgSz w:w="11906" w:h="16838"/>
@@ -589,6 +1238,17 @@
       <w:szCs w:val="16"/>
     </w:rPr>
   </w:style>
+  <w:style w:type="character" w:styleId="Textoennegrita">
+    <w:name w:val="Strong"/>
+    <w:basedOn w:val="Fuentedeprrafopredeter"/>
+    <w:uiPriority w:val="22"/>
+    <w:qFormat/>
+    <w:rsid w:val="00535177"/>
+    <w:rPr>
+      <w:b/>
+      <w:bCs/>
+    </w:rPr>
+  </w:style>
 </w:styles>
 </file>
 
@@ -807,6 +1467,17 @@
       <w:rFonts w:ascii="Tahoma" w:hAnsi="Tahoma" w:cs="Tahoma"/>
       <w:sz w:val="16"/>
       <w:szCs w:val="16"/>
+    </w:rPr>
+  </w:style>
+  <w:style w:type="character" w:styleId="Textoennegrita">
+    <w:name w:val="Strong"/>
+    <w:basedOn w:val="Fuentedeprrafopredeter"/>
+    <w:uiPriority w:val="22"/>
+    <w:qFormat/>
+    <w:rsid w:val="00535177"/>
+    <w:rPr>
+      <w:b/>
+      <w:bCs/>
     </w:rPr>
   </w:style>
 </w:styles>

</xml_diff>